<commit_message>
docs: say 'reviewed items/interactions', not 'purchases'; explain reviews as the purchase proxy
The Amazon Reviews data records reviews, not purchases. Guide, report, overview and paper now use
interaction/review wording, add an explicit note on the proxy, and the guide gains a viva answer
on why demo users have only 4-5 items.

Co-Authored-By: Claude Opus 5.5 <noreply@anthropic.com>
</commit_message>
<xml_diff>
--- a/docs/PROJECT_GUIDE.docx
+++ b/docs/PROJECT_GUIDE.docx
@@ -589,7 +589,7 @@
         <w:spacing w:after="120"/>
       </w:pPr>
       <w:r>
-        <w:t xml:space="preserve">We built a recommender system for video-game products from Amazon. Given what a person bought before, it must guess what they buy next. We compared two very different ways of doing this. The </w:t>
+        <w:t xml:space="preserve">We built a recommender system for video-game products from Amazon. Given the products a person reviewed before, it must guess which product they review next (reviews are the standard stand-in for purchases). We compared two very different ways of doing this. The </w:t>
       </w:r>
       <w:r>
         <w:rPr>
@@ -629,7 +629,7 @@
         <w:t xml:space="preserve">trained neural network (a GRU)</w:t>
       </w:r>
       <w:r>
-        <w:t xml:space="preserve"> that learns patterns from 625,000 past purchases. Our original question was: </w:t>
+        <w:t xml:space="preserve"> that learns patterns from 625,000 past interactions (reviews). Our original question was: </w:t>
       </w:r>
       <w:r>
         <w:rPr>
@@ -659,7 +659,7 @@
         <w:t xml:space="preserve">why</w:t>
       </w:r>
       <w:r>
-        <w:t xml:space="preserve">: people in this dataset have very short histories (typically only 4 purchases), so a network that only sees product ID numbers has almost nothing to learn from. We fixed this by letting the GRU also read the product descriptions (through text embeddings). This </w:t>
+        <w:t xml:space="preserve">: people in this dataset have very short histories (typically only 4–5 reviewed items), so a network that only sees product ID numbers has almost nothing to learn from. We fixed this by letting the GRU also read the product descriptions (through text embeddings). This </w:t>
       </w:r>
       <w:r>
         <w:rPr>
@@ -1046,7 +1046,7 @@
         <w:t xml:space="preserve">Fair comparison:</w:t>
       </w:r>
       <w:r>
-        <w:t xml:space="preserve"> every system ranks the *same* 20 candidate products per user (1 real next purchase + 19 decoys).</w:t>
+        <w:t xml:space="preserve"> every system ranks the *same* 20 candidate products per user (1 real next item + 19 decoys).</w:t>
       </w:r>
     </w:p>
     <w:p>
@@ -1191,7 +1191,7 @@
         <w:t xml:space="preserve">order</w:t>
       </w:r>
       <w:r>
-        <w:t xml:space="preserve">: what you bought most recently matters most.</w:t>
+        <w:t xml:space="preserve">: what you interacted with most recently matters most.</w:t>
       </w:r>
     </w:p>
     <w:p>
@@ -1227,7 +1227,7 @@
         <w:t xml:space="preserve">last</w:t>
       </w:r>
       <w:r>
-        <w:t xml:space="preserve"> purchase is hidden as the test answer, the </w:t>
+        <w:t xml:space="preserve"> reviewed item is hidden as the test answer, the </w:t>
       </w:r>
       <w:r>
         <w:rPr>
@@ -1325,7 +1325,7 @@
         <w:t xml:space="preserve">all-MiniLM-L6-v2</w:t>
       </w:r>
       <w:r>
-        <w:t xml:space="preserve">), a pre-trained sentence encoder that turns a product’s title/category/description into a 384-number vector. Products with similar descriptions get similar vectors even if no one ever bought them together.</w:t>
+        <w:t xml:space="preserve">), a pre-trained sentence encoder that turns a product’s title/category/description into a 384-number vector. Products with similar descriptions get similar vectors even if no user ever reviewed both.</w:t>
       </w:r>
     </w:p>
     <w:p>
@@ -3409,6 +3409,37 @@
     </w:p>
     <w:p>
       <w:pPr>
+        <w:pBdr>
+          <w:left w:val="single" w:color="C55A11" w:sz="18" w:space="8"/>
+        </w:pBdr>
+        <w:shd w:fill="FFF4E5" w:color="auto" w:val="clear"/>
+        <w:spacing w:before="120" w:after="160"/>
+        <w:ind w:left="200" w:right="200"/>
+      </w:pPr>
+      <w:r>
+        <w:rPr>
+          <w:b/>
+          <w:bCs/>
+          <w:color w:val="C55A11"/>
+        </w:rPr>
+        <w:t xml:space="preserve">Reviews, not purchases.  </w:t>
+      </w:r>
+      <w:r>
+        <w:t xml:space="preserve">The dataset records items a user </w:t>
+      </w:r>
+      <w:r>
+        <w:rPr>
+          <w:b/>
+          <w:bCs/>
+        </w:rPr>
+        <w:t xml:space="preserve">reviewed</w:t>
+      </w:r>
+      <w:r>
+        <w:t xml:space="preserve"> (with a star rating), not every purchase — Amazon does not release purchase logs. A user may have bought many more products but reviewed only five. All research on this dataset (including the ARAG paper) treats reviews as the stand-in for purchases; in this guide “history” and “interactions” mean reviewed items.</w:t>
+      </w:r>
+    </w:p>
+    <w:p>
+      <w:pPr>
         <w:spacing w:after="120"/>
       </w:pPr>
       <w:r>
@@ -3432,7 +3463,7 @@
           <wp:inline distT="0" distB="0" distL="0" distR="0">
             <wp:extent cx="5120640" cy="2734679"/>
             <wp:effectExtent t="0" r="0" b="0" l="0"/>
-            <wp:docPr id="1" name="fig08_history_lengths.png" descr="Figure 1 — Training history length per user. The median user has only four training purchases, which is why an ID-only GRU struggles." title="Figure 1 — Training history length per user. The median user has only four training purchases, which is why an ID-only GRU struggles."/>
+            <wp:docPr id="1" name="fig08_history_lengths.png" descr="Figure 1 — Training history length per user. The median user has only four training interactions, which is why an ID-only GRU struggles." title="Figure 1 — Training history length per user. The median user has only four training interactions, which is why an ID-only GRU struggles."/>
             <wp:cNvGraphicFramePr>
               <a:graphicFrameLocks xmlns:a="http://schemas.openxmlformats.org/drawingml/2006/main" noChangeAspect="1"/>
             </wp:cNvGraphicFramePr>
@@ -3481,7 +3512,7 @@
           <w:sz w:val="19"/>
           <w:szCs w:val="19"/>
         </w:rPr>
-        <w:t xml:space="preserve">Figure 1 — Training history length per user. The median user has only four training purchases, which is why an ID-only GRU struggles.</w:t>
+        <w:t xml:space="preserve">Figure 1 — Training history length per user. The median user has only four training interactions, which is why an ID-only GRU struggles.</w:t>
       </w:r>
     </w:p>
     <w:p>
@@ -3516,7 +3547,7 @@
         <w:t xml:space="preserve">one list of 20 products</w:t>
       </w:r>
       <w:r>
-        <w:t xml:space="preserve">: the true next purchase + </w:t>
+        <w:t xml:space="preserve">: the true next item + </w:t>
       </w:r>
       <w:r>
         <w:rPr>
@@ -5143,7 +5174,7 @@
         <w:spacing w:after="60"/>
       </w:pPr>
       <w:r>
-        <w:t xml:space="preserve">The combined vector is used for both input and the tied output, so items with similar descriptions end up close even if they were rarely bought together.</w:t>
+        <w:t xml:space="preserve">The combined vector is used for both input and the tied output, so items with similar descriptions end up close even if they rarely co-occur in histories.</w:t>
       </w:r>
     </w:p>
     <w:p>
@@ -5302,7 +5333,7 @@
         <w:t xml:space="preserve">Popularity:</w:t>
       </w:r>
       <w:r>
-        <w:t xml:space="preserve"> order by training purchase count.</w:t>
+        <w:t xml:space="preserve"> order by training interaction count.</w:t>
       </w:r>
     </w:p>
     <w:p>
@@ -5342,7 +5373,7 @@
         <w:t xml:space="preserve">ItemKNN:</w:t>
       </w:r>
       <w:r>
-        <w:t xml:space="preserve"> item–item cosine similarity from “bought by the same users” counts; score = recency-weighted sum of similarities to history items.</w:t>
+        <w:t xml:space="preserve"> item–item cosine similarity from “reviewed by the same users” counts; score = recency-weighted sum of similarities to history items.</w:t>
       </w:r>
     </w:p>
     <w:p>
@@ -8882,7 +8913,7 @@
         <w:t xml:space="preserve">Pick a user</w:t>
       </w:r>
       <w:r>
-        <w:t xml:space="preserve"> in the “Demo user” dropdown at the top. Expand “This user’s recent history” to see what they bought.</w:t>
+        <w:t xml:space="preserve"> in the “Demo user” dropdown at the top. Expand “This user’s recent history” to see what they reviewed.</w:t>
       </w:r>
     </w:p>
     <w:p>
@@ -9022,7 +9053,7 @@
         <w:t xml:space="preserve">Switch users</w:t>
       </w:r>
       <w:r>
-        <w:t xml:space="preserve"> and compare: a console-game buyer vs. an accessories buyer should get visibly different feeds.</w:t>
+        <w:t xml:space="preserve"> and compare: a console-game fan vs. an accessories reviewer should get visibly different feeds.</w:t>
       </w:r>
     </w:p>
     <w:p>
@@ -15274,7 +15305,7 @@
                 <w:sz w:val="19"/>
                 <w:szCs w:val="19"/>
               </w:rPr>
-              <w:t xml:space="preserve">Other users’ later purchases can be in GRU/ItemKNN training; inherent to the official split, equal across those systems.</w:t>
+              <w:t xml:space="preserve">Other users’ later interactions can be in GRU/ItemKNN training; inherent to the official split, equal across those systems.</w:t>
             </w:r>
           </w:p>
         </w:tc>
@@ -15523,7 +15554,7 @@
         <w:ind w:left="360"/>
       </w:pPr>
       <w:r>
-        <w:t xml:space="preserve">Next-item recommendation: given a user’s purchase history on Amazon (Video Games), rank 20 candidate products so the one they actually bought next is near the top. We compare an agentic LLM recommender (ARAG) with a trained deep sequence model (GRU), and their combination.</w:t>
+        <w:t xml:space="preserve">Next-item recommendation: given a user’s Amazon review history (Video Games), rank 20 candidate products so the item they actually reviewed next is near the top. We compare an agentic LLM recommender (ARAG) with a trained deep sequence model (GRU), and their combination.</w:t>
       </w:r>
     </w:p>
     <w:p>
@@ -15795,7 +15826,7 @@
         <w:ind w:left="360"/>
       </w:pPr>
       <w:r>
-        <w:t xml:space="preserve">No — only product metadata (title, categories, features, description, ≤120 words). Using reviews could leak the target purchase.</w:t>
+        <w:t xml:space="preserve">No — only product metadata (title, categories, features, description, ≤120 words). Using review text could leak the target item.</w:t>
       </w:r>
     </w:p>
     <w:p>
@@ -15816,7 +15847,7 @@
           <w:b/>
           <w:bCs/>
         </w:rPr>
-        <w:t xml:space="preserve">How do you prevent data leakage in the split?</w:t>
+        <w:t xml:space="preserve">Your demo user has only 4–5 items — is that accurate?</w:t>
       </w:r>
     </w:p>
     <w:p>
@@ -15825,15 +15856,26 @@
         <w:ind w:left="360"/>
       </w:pPr>
       <w:r>
-        <w:t xml:space="preserve">We use the official leave-last-out files and assert max(train time) ≤ validation time ≤ test time, and that targets never appear in their own history; the pipeline fails hard otherwise. One known caveat: other users’ later purchases can appear in training (inherent to this split), affecting the trained models equally.</w:t>
-      </w:r>
-    </w:p>
-    <w:p>
-      <w:pPr>
-        <w:pStyle w:val="Heading2"/>
-      </w:pPr>
-      <w:r>
-        <w:t xml:space="preserve">14.3 Evaluation protocol</w:t>
+        <w:t xml:space="preserve">Yes. The data records </w:t>
+      </w:r>
+      <w:r>
+        <w:rPr>
+          <w:b/>
+          <w:bCs/>
+        </w:rPr>
+        <w:t xml:space="preserve">reviews</w:t>
+      </w:r>
+      <w:r>
+        <w:t xml:space="preserve">, not purchases; a user may buy far more but review few. It is the official 5-core benchmark, so every user has at least 5 reviews (one is held out for test, one for validation), and the median user has 5. Histories go up to 472 items; our models use up to the last 50.</w:t>
+      </w:r>
+    </w:p>
+    <w:p>
+      <w:pPr>
+        <w:spacing w:after="80"/>
+        <w:ind w:left="360"/>
+      </w:pPr>
+      <w:r>
+        <w:t xml:space="preserve">That sparsity is realistic and is exactly why the ID-only GRU struggled and adding item text helped.</w:t>
       </w:r>
     </w:p>
     <w:p>
@@ -15854,7 +15896,7 @@
           <w:b/>
           <w:bCs/>
         </w:rPr>
-        <w:t xml:space="preserve">Why do all systems rank the same 20 candidates?</w:t>
+        <w:t xml:space="preserve">How do you prevent data leakage in the split?</w:t>
       </w:r>
     </w:p>
     <w:p>
@@ -15863,7 +15905,15 @@
         <w:ind w:left="360"/>
       </w:pPr>
       <w:r>
-        <w:t xml:space="preserve">To measure ranking, not retrieval. If each system retrieved its own candidates, a retrieval miss would count as a ranking failure.</w:t>
+        <w:t xml:space="preserve">We use the official leave-last-out files and assert max(train time) ≤ validation time ≤ test time, and that targets never appear in their own history; the pipeline fails hard otherwise. One known caveat: other users’ later interactions can appear in training (inherent to this split), affecting the trained models equally.</w:t>
+      </w:r>
+    </w:p>
+    <w:p>
+      <w:pPr>
+        <w:pStyle w:val="Heading2"/>
+      </w:pPr>
+      <w:r>
+        <w:t xml:space="preserve">14.3 Evaluation protocol</w:t>
       </w:r>
     </w:p>
     <w:p>
@@ -15884,7 +15934,7 @@
           <w:b/>
           <w:bCs/>
         </w:rPr>
-        <w:t xml:space="preserve">How are the 19 negatives chosen and why?</w:t>
+        <w:t xml:space="preserve">Why do all systems rank the same 20 candidates?</w:t>
       </w:r>
     </w:p>
     <w:p>
@@ -15893,7 +15943,7 @@
         <w:ind w:left="360"/>
       </w:pPr>
       <w:r>
-        <w:t xml:space="preserve">From the 25,527 items seen in training, proportional to popularity, excluding the user’s own items. This makes decoys about as popular as targets, so popularity alone gives no advantage — popularity scores 0.109, below random (0.125).</w:t>
+        <w:t xml:space="preserve">To measure ranking, not retrieval. If each system retrieved its own candidates, a retrieval miss would count as a ranking failure.</w:t>
       </w:r>
     </w:p>
     <w:p>
@@ -15914,7 +15964,7 @@
           <w:b/>
           <w:bCs/>
         </w:rPr>
-        <w:t xml:space="preserve">Why only 100 users for the LLM systems?</w:t>
+        <w:t xml:space="preserve">How are the 19 negatives chosen and why?</w:t>
       </w:r>
     </w:p>
     <w:p>
@@ -15923,7 +15973,7 @@
         <w:ind w:left="360"/>
       </w:pPr>
       <w:r>
-        <w:t xml:space="preserve">Cost and time: ARAG makes 7 calls per user. 100 users keeps each run around $1. All systems are compared on the same 100 users, and non-LLM systems are additionally evaluated on all 94,762 users.</w:t>
+        <w:t xml:space="preserve">From the 25,527 items seen in training, proportional to popularity, excluding the user’s own items. This makes decoys about as popular as targets, so popularity alone gives no advantage — popularity scores 0.109, below random (0.125).</w:t>
       </w:r>
     </w:p>
     <w:p>
@@ -15944,7 +15994,7 @@
           <w:b/>
           <w:bCs/>
         </w:rPr>
-        <w:t xml:space="preserve">Isn’t 100 users too few?</w:t>
+        <w:t xml:space="preserve">Why only 100 users for the LLM systems?</w:t>
       </w:r>
     </w:p>
     <w:p>
@@ -15953,7 +16003,7 @@
         <w:ind w:left="360"/>
       </w:pPr>
       <w:r>
-        <w:t xml:space="preserve">It is enough to detect large effects (ARAG vs the ID-only GRU, the baselines, the ablation) but not small ones — the CI is about ±0.08–0.10. That is why we report CIs and say the top systems are statistically tied. ~300 users would resolve ~0.05.</w:t>
+        <w:t xml:space="preserve">Cost and time: ARAG makes 7 calls per user. 100 users keeps each run around $1. All systems are compared on the same 100 users, and non-LLM systems are additionally evaluated on all 94,762 users.</w:t>
       </w:r>
     </w:p>
     <w:p>
@@ -15974,7 +16024,7 @@
           <w:b/>
           <w:bCs/>
         </w:rPr>
-        <w:t xml:space="preserve">Why NDCG@5 as the main metric?</w:t>
+        <w:t xml:space="preserve">Isn’t 100 users too few?</w:t>
       </w:r>
     </w:p>
     <w:p>
@@ -15983,7 +16033,7 @@
         <w:ind w:left="360"/>
       </w:pPr>
       <w:r>
-        <w:t xml:space="preserve">It rewards putting the true item high, not just in the top 5, and it is the paper’s headline metric, so our results are comparable in kind.</w:t>
+        <w:t xml:space="preserve">It is enough to detect large effects (ARAG vs the ID-only GRU, the baselines, the ablation) but not small ones — the CI is about ±0.08–0.10. That is why we report CIs and say the top systems are statistically tied. ~300 users would resolve ~0.05.</w:t>
       </w:r>
     </w:p>
     <w:p>
@@ -16004,7 +16054,7 @@
           <w:b/>
           <w:bCs/>
         </w:rPr>
-        <w:t xml:space="preserve">What is the expected Hit@5 of random ranking?</w:t>
+        <w:t xml:space="preserve">Why NDCG@5 as the main metric?</w:t>
       </w:r>
     </w:p>
     <w:p>
@@ -16013,17 +16063,7 @@
         <w:ind w:left="360"/>
       </w:pPr>
       <w:r>
-        <w:t xml:space="preserve">5/20 = </w:t>
-      </w:r>
-      <w:r>
-        <w:rPr>
-          <w:b/>
-          <w:bCs/>
-        </w:rPr>
-        <w:t xml:space="preserve">0.25</w:t>
-      </w:r>
-      <w:r>
-        <w:t xml:space="preserve">. Our random baseline scores 0.252 on all users (0.220 on the 100-user sample, within noise) — a sanity check that the evaluation is correct.</w:t>
+        <w:t xml:space="preserve">It rewards putting the true item high, not just in the top 5, and it is the paper’s headline metric, so our results are comparable in kind.</w:t>
       </w:r>
     </w:p>
     <w:p>
@@ -16044,7 +16084,7 @@
           <w:b/>
           <w:bCs/>
         </w:rPr>
-        <w:t xml:space="preserve">Explain the paired bootstrap.</w:t>
+        <w:t xml:space="preserve">What is the expected Hit@5 of random ranking?</w:t>
       </w:r>
     </w:p>
     <w:p>
@@ -16053,7 +16093,17 @@
         <w:ind w:left="360"/>
       </w:pPr>
       <w:r>
-        <w:t xml:space="preserve">For each user, compute the NDCG difference between two systems. Resample the users with replacement 10,000 times and take the mean difference each time. The 2.5th–97.5th percentiles form the 95% CI. If it excludes zero, the difference is significant. Pairing removes the variation in how hard each user is.</w:t>
+        <w:t xml:space="preserve">5/20 = </w:t>
+      </w:r>
+      <w:r>
+        <w:rPr>
+          <w:b/>
+          <w:bCs/>
+        </w:rPr>
+        <w:t xml:space="preserve">0.25</w:t>
+      </w:r>
+      <w:r>
+        <w:t xml:space="preserve">. Our random baseline scores 0.252 on all users (0.220 on the 100-user sample, within noise) — a sanity check that the evaluation is correct.</w:t>
       </w:r>
     </w:p>
     <w:p>
@@ -16074,7 +16124,7 @@
           <w:b/>
           <w:bCs/>
         </w:rPr>
-        <w:t xml:space="preserve">Why not a t-test?</w:t>
+        <w:t xml:space="preserve">Explain the paired bootstrap.</w:t>
       </w:r>
     </w:p>
     <w:p>
@@ -16083,7 +16133,7 @@
         <w:ind w:left="360"/>
       </w:pPr>
       <w:r>
-        <w:t xml:space="preserve">Per-user NDCG is highly non-normal (many zeros). The bootstrap makes no normality assumption. A Wilcoxon signed-rank test would be a valid alternative.</w:t>
+        <w:t xml:space="preserve">For each user, compute the NDCG difference between two systems. Resample the users with replacement 10,000 times and take the mean difference each time. The 2.5th–97.5th percentiles form the 95% CI. If it excludes zero, the difference is significant. Pairing removes the variation in how hard each user is.</w:t>
       </w:r>
     </w:p>
     <w:p>
@@ -16104,7 +16154,7 @@
           <w:b/>
           <w:bCs/>
         </w:rPr>
-        <w:t xml:space="preserve">How did you tune hyperparameters without touching test?</w:t>
+        <w:t xml:space="preserve">Why not a t-test?</w:t>
       </w:r>
     </w:p>
     <w:p>
@@ -16113,15 +16163,7 @@
         <w:ind w:left="360"/>
       </w:pPr>
       <w:r>
-        <w:t xml:space="preserve">θ, α, the recency decay and the GRU checkpoint were all chosen on validation users; the test set was evaluated once at the end.</w:t>
-      </w:r>
-    </w:p>
-    <w:p>
-      <w:pPr>
-        <w:pStyle w:val="Heading2"/>
-      </w:pPr>
-      <w:r>
-        <w:t xml:space="preserve">14.4 ARAG and the LLM side</w:t>
+        <w:t xml:space="preserve">Per-user NDCG is highly non-normal (many zeros). The bootstrap makes no normality assumption. A Wilcoxon signed-rank test would be a valid alternative.</w:t>
       </w:r>
     </w:p>
     <w:p>
@@ -16142,7 +16184,7 @@
           <w:b/>
           <w:bCs/>
         </w:rPr>
-        <w:t xml:space="preserve">Explain the four ARAG agents.</w:t>
+        <w:t xml:space="preserve">How did you tune hyperparameters without touching test?</w:t>
       </w:r>
     </w:p>
     <w:p>
@@ -16151,7 +16193,15 @@
         <w:ind w:left="360"/>
       </w:pPr>
       <w:r>
-        <w:t xml:space="preserve">UUA summarises the user’s interests and intent; NLI scores every candidate 0–10 for compatibility with the history; CSA summarises the candidates that pass θ = 5; IRA ranks all 20 using both summaries. UUA and NLI run in parallel. 7 LLM calls per user.</w:t>
+        <w:t xml:space="preserve">θ, α, the recency decay and the GRU checkpoint were all chosen on validation users; the test set was evaluated once at the end.</w:t>
+      </w:r>
+    </w:p>
+    <w:p>
+      <w:pPr>
+        <w:pStyle w:val="Heading2"/>
+      </w:pPr>
+      <w:r>
+        <w:t xml:space="preserve">14.4 ARAG and the LLM side</w:t>
       </w:r>
     </w:p>
     <w:p>
@@ -16172,7 +16222,7 @@
           <w:b/>
           <w:bCs/>
         </w:rPr>
-        <w:t xml:space="preserve">What is θ and how was it chosen?</w:t>
+        <w:t xml:space="preserve">Explain the four ARAG agents.</w:t>
       </w:r>
     </w:p>
     <w:p>
@@ -16181,17 +16231,7 @@
         <w:ind w:left="360"/>
       </w:pPr>
       <w:r>
-        <w:t xml:space="preserve">The NLI acceptance threshold. Validation NDCG@5 for θ = 4/5/6/7 was 0.4228/</w:t>
-      </w:r>
-      <w:r>
-        <w:rPr>
-          <w:b/>
-          <w:bCs/>
-        </w:rPr>
-        <w:t xml:space="preserve">0.4305</w:t>
-      </w:r>
-      <w:r>
-        <w:t xml:space="preserve">/0.3993/0.3962, so θ* = 5.</w:t>
+        <w:t xml:space="preserve">UUA summarises the user’s interests and intent; NLI scores every candidate 0–10 for compatibility with the history; CSA summarises the candidates that pass θ = 5; IRA ranks all 20 using both summaries. UUA and NLI run in parallel. 7 LLM calls per user.</w:t>
       </w:r>
     </w:p>
     <w:p>
@@ -16212,7 +16252,7 @@
           <w:b/>
           <w:bCs/>
         </w:rPr>
-        <w:t xml:space="preserve">What if the LLM returns invalid output?</w:t>
+        <w:t xml:space="preserve">What is θ and how was it chosen?</w:t>
       </w:r>
     </w:p>
     <w:p>
@@ -16221,7 +16261,17 @@
         <w:ind w:left="360"/>
       </w:pPr>
       <w:r>
-        <w:t xml:space="preserve">Outputs use strict JSON schemas and are validated. One retry with the validation error; then a documented fallback (e.g. neutral NLI score 5). The ranking parser repairs unknown or duplicate IDs. Every fallback and repair is counted, not hidden.</w:t>
+        <w:t xml:space="preserve">The NLI acceptance threshold. Validation NDCG@5 for θ = 4/5/6/7 was 0.4228/</w:t>
+      </w:r>
+      <w:r>
+        <w:rPr>
+          <w:b/>
+          <w:bCs/>
+        </w:rPr>
+        <w:t xml:space="preserve">0.4305</w:t>
+      </w:r>
+      <w:r>
+        <w:t xml:space="preserve">/0.3993/0.3962, so θ* = 5.</w:t>
       </w:r>
     </w:p>
     <w:p>
@@ -16236,6 +16286,36 @@
           <w:color w:val="C00000"/>
         </w:rPr>
         <w:t xml:space="preserve">Q23. </w:t>
+      </w:r>
+      <w:r>
+        <w:rPr>
+          <w:b/>
+          <w:bCs/>
+        </w:rPr>
+        <w:t xml:space="preserve">What if the LLM returns invalid output?</w:t>
+      </w:r>
+    </w:p>
+    <w:p>
+      <w:pPr>
+        <w:spacing w:after="80"/>
+        <w:ind w:left="360"/>
+      </w:pPr>
+      <w:r>
+        <w:t xml:space="preserve">Outputs use strict JSON schemas and are validated. One retry with the validation error; then a documented fallback (e.g. neutral NLI score 5). The ranking parser repairs unknown or duplicate IDs. Every fallback and repair is counted, not hidden.</w:t>
+      </w:r>
+    </w:p>
+    <w:p>
+      <w:pPr>
+        <w:keepNext/>
+        <w:spacing w:before="160" w:after="60"/>
+      </w:pPr>
+      <w:r>
+        <w:rPr>
+          <w:b/>
+          <w:bCs/>
+          <w:color w:val="C00000"/>
+        </w:rPr>
+        <w:t xml:space="preserve">Q24. </w:t>
       </w:r>
       <w:r>
         <w:rPr>
@@ -16277,7 +16357,7 @@
           <w:bCs/>
           <w:color w:val="C00000"/>
         </w:rPr>
-        <w:t xml:space="preserve">Q24. </w:t>
+        <w:t xml:space="preserve">Q25. </w:t>
       </w:r>
       <w:r>
         <w:rPr>
@@ -16317,7 +16397,7 @@
           <w:bCs/>
           <w:color w:val="C00000"/>
         </w:rPr>
-        <w:t xml:space="preserve">Q25. </w:t>
+        <w:t xml:space="preserve">Q26. </w:t>
       </w:r>
       <w:r>
         <w:rPr>
@@ -16355,7 +16435,7 @@
           <w:bCs/>
           <w:color w:val="C00000"/>
         </w:rPr>
-        <w:t xml:space="preserve">Q26. </w:t>
+        <w:t xml:space="preserve">Q27. </w:t>
       </w:r>
       <w:r>
         <w:rPr>
@@ -16385,7 +16465,7 @@
           <w:bCs/>
           <w:color w:val="C00000"/>
         </w:rPr>
-        <w:t xml:space="preserve">Q27. </w:t>
+        <w:t xml:space="preserve">Q28. </w:t>
       </w:r>
       <w:r>
         <w:rPr>
@@ -16415,7 +16495,7 @@
           <w:bCs/>
           <w:color w:val="C00000"/>
         </w:rPr>
-        <w:t xml:space="preserve">Q28. </w:t>
+        <w:t xml:space="preserve">Q29. </w:t>
       </w:r>
       <w:r>
         <w:rPr>
@@ -16445,7 +16525,7 @@
           <w:bCs/>
           <w:color w:val="C00000"/>
         </w:rPr>
-        <w:t xml:space="preserve">Q29. </w:t>
+        <w:t xml:space="preserve">Q30. </w:t>
       </w:r>
       <w:r>
         <w:rPr>
@@ -16475,7 +16555,7 @@
           <w:bCs/>
           <w:color w:val="C00000"/>
         </w:rPr>
-        <w:t xml:space="preserve">Q30. </w:t>
+        <w:t xml:space="preserve">Q31. </w:t>
       </w:r>
       <w:r>
         <w:rPr>
@@ -16491,7 +16571,7 @@
         <w:ind w:left="360"/>
       </w:pPr>
       <w:r>
-        <w:t xml:space="preserve">It lets the model generalise across items: two products with similar descriptions get similar vectors even if they were rarely bought together. With 3–5 purchases per user, this shared content signal fills in what the ID embeddings cannot learn.</w:t>
+        <w:t xml:space="preserve">It lets the model generalise across items: two products with similar descriptions get similar vectors even if they rarely co-occur. With 3–5 interactions per user, this shared content signal fills in what the ID embeddings cannot learn.</w:t>
       </w:r>
     </w:p>
     <w:p>
@@ -16505,7 +16585,7 @@
           <w:bCs/>
           <w:color w:val="C00000"/>
         </w:rPr>
-        <w:t xml:space="preserve">Q31. </w:t>
+        <w:t xml:space="preserve">Q32. </w:t>
       </w:r>
       <w:r>
         <w:rPr>
@@ -16535,7 +16615,7 @@
           <w:bCs/>
           <w:color w:val="C00000"/>
         </w:rPr>
-        <w:t xml:space="preserve">Q32. </w:t>
+        <w:t xml:space="preserve">Q33. </w:t>
       </w:r>
       <w:r>
         <w:rPr>
@@ -16565,7 +16645,7 @@
           <w:bCs/>
           <w:color w:val="C00000"/>
         </w:rPr>
-        <w:t xml:space="preserve">Q33. </w:t>
+        <w:t xml:space="preserve">Q34. </w:t>
       </w:r>
       <w:r>
         <w:rPr>
@@ -16595,7 +16675,7 @@
           <w:bCs/>
           <w:color w:val="C00000"/>
         </w:rPr>
-        <w:t xml:space="preserve">Q34. </w:t>
+        <w:t xml:space="preserve">Q35. </w:t>
       </w:r>
       <w:r>
         <w:rPr>
@@ -16645,7 +16725,7 @@
           <w:bCs/>
           <w:color w:val="C00000"/>
         </w:rPr>
-        <w:t xml:space="preserve">Q35. </w:t>
+        <w:t xml:space="preserve">Q36. </w:t>
       </w:r>
       <w:r>
         <w:rPr>
@@ -16675,7 +16755,7 @@
           <w:bCs/>
           <w:color w:val="C00000"/>
         </w:rPr>
-        <w:t xml:space="preserve">Q36. </w:t>
+        <w:t xml:space="preserve">Q37. </w:t>
       </w:r>
       <w:r>
         <w:rPr>
@@ -16713,7 +16793,7 @@
           <w:bCs/>
           <w:color w:val="C00000"/>
         </w:rPr>
-        <w:t xml:space="preserve">Q37. </w:t>
+        <w:t xml:space="preserve">Q38. </w:t>
       </w:r>
       <w:r>
         <w:rPr>
@@ -16743,7 +16823,7 @@
           <w:bCs/>
           <w:color w:val="C00000"/>
         </w:rPr>
-        <w:t xml:space="preserve">Q38. </w:t>
+        <w:t xml:space="preserve">Q39. </w:t>
       </w:r>
       <w:r>
         <w:rPr>
@@ -16773,7 +16853,7 @@
           <w:bCs/>
           <w:color w:val="C00000"/>
         </w:rPr>
-        <w:t xml:space="preserve">Q39. </w:t>
+        <w:t xml:space="preserve">Q40. </w:t>
       </w:r>
       <w:r>
         <w:rPr>
@@ -16803,7 +16883,7 @@
           <w:bCs/>
           <w:color w:val="C00000"/>
         </w:rPr>
-        <w:t xml:space="preserve">Q40. </w:t>
+        <w:t xml:space="preserve">Q41. </w:t>
       </w:r>
       <w:r>
         <w:rPr>
@@ -16833,7 +16913,7 @@
           <w:bCs/>
           <w:color w:val="C00000"/>
         </w:rPr>
-        <w:t xml:space="preserve">Q41. </w:t>
+        <w:t xml:space="preserve">Q42. </w:t>
       </w:r>
       <w:r>
         <w:rPr>
@@ -16871,7 +16951,7 @@
           <w:bCs/>
           <w:color w:val="C00000"/>
         </w:rPr>
-        <w:t xml:space="preserve">Q42. </w:t>
+        <w:t xml:space="preserve">Q43. </w:t>
       </w:r>
       <w:r>
         <w:rPr>
@@ -16901,7 +16981,7 @@
           <w:bCs/>
           <w:color w:val="C00000"/>
         </w:rPr>
-        <w:t xml:space="preserve">Q43. </w:t>
+        <w:t xml:space="preserve">Q44. </w:t>
       </w:r>
       <w:r>
         <w:rPr>
@@ -16931,7 +17011,7 @@
           <w:bCs/>
           <w:color w:val="C00000"/>
         </w:rPr>
-        <w:t xml:space="preserve">Q44. </w:t>
+        <w:t xml:space="preserve">Q45. </w:t>
       </w:r>
       <w:r>
         <w:rPr>
@@ -16961,7 +17041,7 @@
           <w:bCs/>
           <w:color w:val="C00000"/>
         </w:rPr>
-        <w:t xml:space="preserve">Q45. </w:t>
+        <w:t xml:space="preserve">Q46. </w:t>
       </w:r>
       <w:r>
         <w:rPr>
@@ -16991,7 +17071,7 @@
           <w:bCs/>
           <w:color w:val="C00000"/>
         </w:rPr>
-        <w:t xml:space="preserve">Q46. </w:t>
+        <w:t xml:space="preserve">Q47. </w:t>
       </w:r>
       <w:r>
         <w:rPr>
@@ -17029,7 +17109,7 @@
           <w:bCs/>
           <w:color w:val="C00000"/>
         </w:rPr>
-        <w:t xml:space="preserve">Q47. </w:t>
+        <w:t xml:space="preserve">Q48. </w:t>
       </w:r>
       <w:r>
         <w:rPr>
@@ -17080,7 +17160,7 @@
           <w:bCs/>
           <w:color w:val="C00000"/>
         </w:rPr>
-        <w:t xml:space="preserve">Q48. </w:t>
+        <w:t xml:space="preserve">Q49. </w:t>
       </w:r>
       <w:r>
         <w:rPr>
@@ -17117,7 +17197,7 @@
           <w:bCs/>
           <w:color w:val="C00000"/>
         </w:rPr>
-        <w:t xml:space="preserve">Q49. </w:t>
+        <w:t xml:space="preserve">Q50. </w:t>
       </w:r>
       <w:r>
         <w:rPr>
@@ -17147,7 +17227,7 @@
           <w:bCs/>
           <w:color w:val="C00000"/>
         </w:rPr>
-        <w:t xml:space="preserve">Q50. </w:t>
+        <w:t xml:space="preserve">Q51. </w:t>
       </w:r>
       <w:r>
         <w:rPr>
@@ -17177,7 +17257,7 @@
           <w:bCs/>
           <w:color w:val="C00000"/>
         </w:rPr>
-        <w:t xml:space="preserve">Q51. </w:t>
+        <w:t xml:space="preserve">Q52. </w:t>
       </w:r>
       <w:r>
         <w:rPr>
@@ -17215,7 +17295,7 @@
           <w:bCs/>
           <w:color w:val="C00000"/>
         </w:rPr>
-        <w:t xml:space="preserve">Q52. </w:t>
+        <w:t xml:space="preserve">Q53. </w:t>
       </w:r>
       <w:r>
         <w:rPr>
@@ -17245,7 +17325,7 @@
           <w:bCs/>
           <w:color w:val="C00000"/>
         </w:rPr>
-        <w:t xml:space="preserve">Q53. </w:t>
+        <w:t xml:space="preserve">Q54. </w:t>
       </w:r>
       <w:r>
         <w:rPr>
@@ -17275,7 +17355,7 @@
           <w:bCs/>
           <w:color w:val="C00000"/>
         </w:rPr>
-        <w:t xml:space="preserve">Q54. </w:t>
+        <w:t xml:space="preserve">Q55. </w:t>
       </w:r>
       <w:r>
         <w:rPr>
@@ -17305,7 +17385,7 @@
           <w:bCs/>
           <w:color w:val="C00000"/>
         </w:rPr>
-        <w:t xml:space="preserve">Q55. </w:t>
+        <w:t xml:space="preserve">Q56. </w:t>
       </w:r>
       <w:r>
         <w:rPr>
@@ -17335,7 +17415,7 @@
           <w:bCs/>
           <w:color w:val="C00000"/>
         </w:rPr>
-        <w:t xml:space="preserve">Q56. </w:t>
+        <w:t xml:space="preserve">Q57. </w:t>
       </w:r>
       <w:r>
         <w:rPr>

</xml_diff>